<commit_message>
Auto Daily 8:00 PM Dashboard Update [2026-08-18 20:00]
</commit_message>
<xml_diff>
--- a/docs/weekly/2026-W34_當週執行率回顧報告.docx
+++ b/docs/weekly/2026-W34_當週執行率回顧報告.docx
@@ -21,7 +21,7 @@
           <w:color w:val="555555"/>
           <w:sz w:val="20"/>
         </w:rPr>
-        <w:t>週期：2026/08/17–2026/08/23　｜　整體時間執行率：9.3%</w:t>
+        <w:t>週期：2026/08/17–2026/08/23　｜　整體時間執行率：25.4%</w:t>
       </w:r>
     </w:p>
     <w:p>
@@ -783,7 +783,7 @@
                 <w:color w:val="000000"/>
                 <w:sz w:val="19"/>
               </w:rPr>
-              <w:t>0.00 hr</w:t>
+              <w:t>0.95 hr</w:t>
             </w:r>
           </w:p>
         </w:tc>
@@ -810,7 +810,7 @@
                 <w:color w:val="000000"/>
                 <w:sz w:val="19"/>
               </w:rPr>
-              <w:t>0.0%</w:t>
+              <w:t>51.8%</w:t>
             </w:r>
           </w:p>
         </w:tc>
@@ -864,7 +864,7 @@
                 <w:color w:val="000000"/>
                 <w:sz w:val="19"/>
               </w:rPr>
-              <w:t>0.00 km</w:t>
+              <w:t>9.45 km</w:t>
             </w:r>
           </w:p>
         </w:tc>
@@ -891,7 +891,7 @@
                 <w:color w:val="000000"/>
                 <w:sz w:val="19"/>
               </w:rPr>
-              <w:t>0.0%</w:t>
+              <w:t>64.7%</w:t>
             </w:r>
           </w:p>
         </w:tc>
@@ -1797,7 +1797,7 @@
                 <w:color w:val="000000"/>
                 <w:sz w:val="19"/>
               </w:rPr>
-              <w:t>0分</w:t>
+              <w:t>57分 / 9.45km</w:t>
             </w:r>
           </w:p>
         </w:tc>
@@ -1824,7 +1824,7 @@
                 <w:color w:val="000000"/>
                 <w:sz w:val="19"/>
               </w:rPr>
-              <w:t>❌ 未執行</w:t>
+              <w:t>✅ 已完成</w:t>
             </w:r>
           </w:p>
         </w:tc>
@@ -2847,7 +2847,7 @@
     </w:p>
     <w:p>
       <w:r>
-        <w:t>• 當週累積自行車 6.24 km、跑步 0.00 km、游泳 0.00 km，整體時間執行率達 9.3%。</w:t>
+        <w:t>• 當週累積自行車 6.24 km、跑步 9.45 km、游泳 0.00 km，整體時間執行率達 25.4%。</w:t>
         <w:br/>
       </w:r>
       <w:r>

</xml_diff>

<commit_message>
Auto Daily Dashboard Update [2026-08-19 16:37]
</commit_message>
<xml_diff>
--- a/docs/weekly/2026-W34_當週執行率回顧報告.docx
+++ b/docs/weekly/2026-W34_當週執行率回顧報告.docx
@@ -21,7 +21,7 @@
           <w:color w:val="555555"/>
           <w:sz w:val="20"/>
         </w:rPr>
-        <w:t>週期：2026/08/17–2026/08/23　｜　整體時間執行率：25.4%</w:t>
+        <w:t>週期：2026/08/17–2026/08/23　｜　整體時間執行率：43.1%</w:t>
       </w:r>
     </w:p>
     <w:p>
@@ -347,7 +347,7 @@
                 <w:color w:val="000000"/>
                 <w:sz w:val="19"/>
               </w:rPr>
-              <w:t>0.00 hr</w:t>
+              <w:t>1.05 hr</w:t>
             </w:r>
           </w:p>
         </w:tc>
@@ -374,7 +374,7 @@
                 <w:color w:val="000000"/>
                 <w:sz w:val="19"/>
               </w:rPr>
-              <w:t>0.0%</w:t>
+              <w:t>39.4%</w:t>
             </w:r>
           </w:p>
         </w:tc>
@@ -428,7 +428,7 @@
                 <w:color w:val="000000"/>
                 <w:sz w:val="19"/>
               </w:rPr>
-              <w:t>0.00 km</w:t>
+              <w:t>3.15 km</w:t>
             </w:r>
           </w:p>
         </w:tc>
@@ -1963,7 +1963,7 @@
                 <w:color w:val="000000"/>
                 <w:sz w:val="19"/>
               </w:rPr>
-              <w:t>0分</w:t>
+              <w:t>63分 / 3.15km</w:t>
             </w:r>
           </w:p>
         </w:tc>
@@ -1990,7 +1990,7 @@
                 <w:color w:val="000000"/>
                 <w:sz w:val="19"/>
               </w:rPr>
-              <w:t>❌ 未執行</w:t>
+              <w:t>✅ 已完成</w:t>
             </w:r>
           </w:p>
         </w:tc>
@@ -2847,7 +2847,7 @@
     </w:p>
     <w:p>
       <w:r>
-        <w:t>• 當週累積自行車 6.24 km、跑步 9.45 km、游泳 0.00 km，整體時間執行率達 25.4%。</w:t>
+        <w:t>• 當週累積自行車 6.24 km、跑步 9.45 km、游泳 3.15 km，整體時間執行率達 43.1%。</w:t>
         <w:br/>
       </w:r>
       <w:r>

</xml_diff>

<commit_message>
Auto Daily 8:00 PM Dashboard Update [2026-08-20 20:00]
</commit_message>
<xml_diff>
--- a/docs/weekly/2026-W34_當週執行率回顧報告.docx
+++ b/docs/weekly/2026-W34_當週執行率回顧報告.docx
@@ -21,7 +21,7 @@
           <w:color w:val="555555"/>
           <w:sz w:val="20"/>
         </w:rPr>
-        <w:t>週期：2026/08/17–2026/08/23　｜　整體時間執行率：43.1%</w:t>
+        <w:t>週期：2026/08/17–2026/08/23　｜　整體時間執行率：74.9%</w:t>
       </w:r>
     </w:p>
     <w:p>
@@ -565,7 +565,7 @@
                 <w:color w:val="000000"/>
                 <w:sz w:val="19"/>
               </w:rPr>
-              <w:t>0.55 hr</w:t>
+              <w:t>1.97 hr</w:t>
             </w:r>
           </w:p>
         </w:tc>
@@ -592,7 +592,7 @@
                 <w:color w:val="000000"/>
                 <w:sz w:val="19"/>
               </w:rPr>
-              <w:t>38.8%</w:t>
+              <w:t>138.8%</w:t>
             </w:r>
           </w:p>
         </w:tc>
@@ -646,7 +646,7 @@
                 <w:color w:val="000000"/>
                 <w:sz w:val="19"/>
               </w:rPr>
-              <w:t>6.24 km</w:t>
+              <w:t>41.40 km</w:t>
             </w:r>
           </w:p>
         </w:tc>
@@ -783,7 +783,7 @@
                 <w:color w:val="000000"/>
                 <w:sz w:val="19"/>
               </w:rPr>
-              <w:t>0.95 hr</w:t>
+              <w:t>1.42 hr</w:t>
             </w:r>
           </w:p>
         </w:tc>
@@ -810,7 +810,7 @@
                 <w:color w:val="000000"/>
                 <w:sz w:val="19"/>
               </w:rPr>
-              <w:t>51.8%</w:t>
+              <w:t>77.3%</w:t>
             </w:r>
           </w:p>
         </w:tc>
@@ -864,7 +864,7 @@
                 <w:color w:val="000000"/>
                 <w:sz w:val="19"/>
               </w:rPr>
-              <w:t>9.45 km</w:t>
+              <w:t>13.11 km</w:t>
             </w:r>
           </w:p>
         </w:tc>
@@ -891,7 +891,7 @@
                 <w:color w:val="000000"/>
                 <w:sz w:val="19"/>
               </w:rPr>
-              <w:t>64.7%</w:t>
+              <w:t>89.8%</w:t>
             </w:r>
           </w:p>
         </w:tc>
@@ -2129,7 +2129,7 @@
                 <w:color w:val="000000"/>
                 <w:sz w:val="19"/>
               </w:rPr>
-              <w:t>0分</w:t>
+              <w:t>85分 / 35.16km</w:t>
             </w:r>
           </w:p>
         </w:tc>
@@ -2156,7 +2156,7 @@
                 <w:color w:val="000000"/>
                 <w:sz w:val="19"/>
               </w:rPr>
-              <w:t>❌ 未執行</w:t>
+              <w:t>✅ 已完成</w:t>
             </w:r>
           </w:p>
         </w:tc>
@@ -2295,7 +2295,7 @@
                 <w:color w:val="000000"/>
                 <w:sz w:val="19"/>
               </w:rPr>
-              <w:t>0分</w:t>
+              <w:t>28分 / 3.66km</w:t>
             </w:r>
           </w:p>
         </w:tc>
@@ -2322,7 +2322,7 @@
                 <w:color w:val="000000"/>
                 <w:sz w:val="19"/>
               </w:rPr>
-              <w:t>❌ 未執行</w:t>
+              <w:t>✅ 已完成</w:t>
             </w:r>
           </w:p>
         </w:tc>
@@ -2847,7 +2847,7 @@
     </w:p>
     <w:p>
       <w:r>
-        <w:t>• 當週累積自行車 6.24 km、跑步 9.45 km、游泳 3.15 km，整體時間執行率達 43.1%。</w:t>
+        <w:t>• 當週累積自行車 41.40 km、跑步 13.11 km、游泳 3.15 km，整體時間執行率達 74.9%。</w:t>
         <w:br/>
       </w:r>
       <w:r>

</xml_diff>

<commit_message>
Upgrade daily workout completeness indicators and professional triathlon coach insights
</commit_message>
<xml_diff>
--- a/docs/weekly/2026-W34_當週執行率回顧報告.docx
+++ b/docs/weekly/2026-W34_當週執行率回顧報告.docx
@@ -1160,17 +1160,17 @@
         <w:tblInd w:w="120" w:type="dxa"/>
       </w:tblPr>
       <w:tblGrid>
-        <w:gridCol w:w="1100"/>
-        <w:gridCol w:w="3100"/>
-        <w:gridCol w:w="1100"/>
-        <w:gridCol w:w="1600"/>
-        <w:gridCol w:w="1600"/>
-        <w:gridCol w:w="1160"/>
+        <w:gridCol w:w="1050"/>
+        <w:gridCol w:w="2750"/>
+        <w:gridCol w:w="1050"/>
+        <w:gridCol w:w="1500"/>
+        <w:gridCol w:w="1500"/>
+        <w:gridCol w:w="1810"/>
       </w:tblGrid>
       <w:tr>
         <w:tc>
           <w:tcPr>
-            <w:tcW w:type="dxa" w:w="1100"/>
+            <w:tcW w:type="dxa" w:w="1050"/>
             <w:shd w:fill="595959"/>
             <w:tcMar>
               <w:top w:w="80" w:type="dxa"/>
@@ -1197,7 +1197,7 @@
         </w:tc>
         <w:tc>
           <w:tcPr>
-            <w:tcW w:type="dxa" w:w="3100"/>
+            <w:tcW w:type="dxa" w:w="2750"/>
             <w:shd w:fill="595959"/>
             <w:tcMar>
               <w:top w:w="80" w:type="dxa"/>
@@ -1224,7 +1224,7 @@
         </w:tc>
         <w:tc>
           <w:tcPr>
-            <w:tcW w:type="dxa" w:w="1100"/>
+            <w:tcW w:type="dxa" w:w="1050"/>
             <w:shd w:fill="595959"/>
             <w:tcMar>
               <w:top w:w="80" w:type="dxa"/>
@@ -1251,7 +1251,7 @@
         </w:tc>
         <w:tc>
           <w:tcPr>
-            <w:tcW w:type="dxa" w:w="1600"/>
+            <w:tcW w:type="dxa" w:w="1500"/>
             <w:shd w:fill="595959"/>
             <w:tcMar>
               <w:top w:w="80" w:type="dxa"/>
@@ -1278,7 +1278,7 @@
         </w:tc>
         <w:tc>
           <w:tcPr>
-            <w:tcW w:type="dxa" w:w="1600"/>
+            <w:tcW w:type="dxa" w:w="1500"/>
             <w:shd w:fill="595959"/>
             <w:tcMar>
               <w:top w:w="80" w:type="dxa"/>
@@ -1305,7 +1305,7 @@
         </w:tc>
         <w:tc>
           <w:tcPr>
-            <w:tcW w:type="dxa" w:w="1160"/>
+            <w:tcW w:type="dxa" w:w="1810"/>
             <w:shd w:fill="595959"/>
             <w:tcMar>
               <w:top w:w="80" w:type="dxa"/>
@@ -1334,7 +1334,7 @@
       <w:tr>
         <w:tc>
           <w:tcPr>
-            <w:tcW w:type="dxa" w:w="1100"/>
+            <w:tcW w:type="dxa" w:w="1050"/>
             <w:tcMar>
               <w:top w:w="80" w:type="dxa"/>
               <w:start w:w="120" w:type="dxa"/>
@@ -1363,7 +1363,7 @@
         </w:tc>
         <w:tc>
           <w:tcPr>
-            <w:tcW w:type="dxa" w:w="3100"/>
+            <w:tcW w:type="dxa" w:w="2750"/>
             <w:tcMar>
               <w:top w:w="80" w:type="dxa"/>
               <w:start w:w="120" w:type="dxa"/>
@@ -1390,7 +1390,7 @@
         </w:tc>
         <w:tc>
           <w:tcPr>
-            <w:tcW w:type="dxa" w:w="1100"/>
+            <w:tcW w:type="dxa" w:w="1050"/>
             <w:tcMar>
               <w:top w:w="80" w:type="dxa"/>
               <w:start w:w="120" w:type="dxa"/>
@@ -1417,7 +1417,7 @@
         </w:tc>
         <w:tc>
           <w:tcPr>
-            <w:tcW w:type="dxa" w:w="1600"/>
+            <w:tcW w:type="dxa" w:w="1500"/>
             <w:tcMar>
               <w:top w:w="80" w:type="dxa"/>
               <w:start w:w="120" w:type="dxa"/>
@@ -1444,7 +1444,7 @@
         </w:tc>
         <w:tc>
           <w:tcPr>
-            <w:tcW w:type="dxa" w:w="1600"/>
+            <w:tcW w:type="dxa" w:w="1500"/>
             <w:tcMar>
               <w:top w:w="80" w:type="dxa"/>
               <w:start w:w="120" w:type="dxa"/>
@@ -1471,7 +1471,7 @@
         </w:tc>
         <w:tc>
           <w:tcPr>
-            <w:tcW w:type="dxa" w:w="1160"/>
+            <w:tcW w:type="dxa" w:w="1810"/>
             <w:tcMar>
               <w:top w:w="80" w:type="dxa"/>
               <w:start w:w="120" w:type="dxa"/>
@@ -1492,7 +1492,7 @@
                 <w:color w:val="000000"/>
                 <w:sz w:val="19"/>
               </w:rPr>
-              <w:t>✅ 已完成</w:t>
+              <w:t>✨ 動態排酸 (A)</w:t>
             </w:r>
           </w:p>
         </w:tc>
@@ -1500,7 +1500,7 @@
       <w:tr>
         <w:tc>
           <w:tcPr>
-            <w:tcW w:type="dxa" w:w="1100"/>
+            <w:tcW w:type="dxa" w:w="1050"/>
             <w:tcMar>
               <w:top w:w="80" w:type="dxa"/>
               <w:start w:w="120" w:type="dxa"/>
@@ -1529,7 +1529,7 @@
         </w:tc>
         <w:tc>
           <w:tcPr>
-            <w:tcW w:type="dxa" w:w="3100"/>
+            <w:tcW w:type="dxa" w:w="2750"/>
             <w:tcMar>
               <w:top w:w="80" w:type="dxa"/>
               <w:start w:w="120" w:type="dxa"/>
@@ -1556,7 +1556,7 @@
         </w:tc>
         <w:tc>
           <w:tcPr>
-            <w:tcW w:type="dxa" w:w="1100"/>
+            <w:tcW w:type="dxa" w:w="1050"/>
             <w:tcMar>
               <w:top w:w="80" w:type="dxa"/>
               <w:start w:w="120" w:type="dxa"/>
@@ -1583,7 +1583,7 @@
         </w:tc>
         <w:tc>
           <w:tcPr>
-            <w:tcW w:type="dxa" w:w="1600"/>
+            <w:tcW w:type="dxa" w:w="1500"/>
             <w:tcMar>
               <w:top w:w="80" w:type="dxa"/>
               <w:start w:w="120" w:type="dxa"/>
@@ -1610,7 +1610,7 @@
         </w:tc>
         <w:tc>
           <w:tcPr>
-            <w:tcW w:type="dxa" w:w="1600"/>
+            <w:tcW w:type="dxa" w:w="1500"/>
             <w:tcMar>
               <w:top w:w="80" w:type="dxa"/>
               <w:start w:w="120" w:type="dxa"/>
@@ -1637,7 +1637,7 @@
         </w:tc>
         <w:tc>
           <w:tcPr>
-            <w:tcW w:type="dxa" w:w="1160"/>
+            <w:tcW w:type="dxa" w:w="1810"/>
             <w:tcMar>
               <w:top w:w="80" w:type="dxa"/>
               <w:start w:w="120" w:type="dxa"/>
@@ -1658,7 +1658,7 @@
                 <w:color w:val="000000"/>
                 <w:sz w:val="19"/>
               </w:rPr>
-              <w:t>休息日</w:t>
+              <w:t>⏸️ 完全休息日</w:t>
             </w:r>
           </w:p>
         </w:tc>
@@ -1666,7 +1666,7 @@
       <w:tr>
         <w:tc>
           <w:tcPr>
-            <w:tcW w:type="dxa" w:w="1100"/>
+            <w:tcW w:type="dxa" w:w="1050"/>
             <w:tcMar>
               <w:top w:w="80" w:type="dxa"/>
               <w:start w:w="120" w:type="dxa"/>
@@ -1695,7 +1695,7 @@
         </w:tc>
         <w:tc>
           <w:tcPr>
-            <w:tcW w:type="dxa" w:w="3100"/>
+            <w:tcW w:type="dxa" w:w="2750"/>
             <w:tcMar>
               <w:top w:w="80" w:type="dxa"/>
               <w:start w:w="120" w:type="dxa"/>
@@ -1722,7 +1722,7 @@
         </w:tc>
         <w:tc>
           <w:tcPr>
-            <w:tcW w:type="dxa" w:w="1100"/>
+            <w:tcW w:type="dxa" w:w="1050"/>
             <w:tcMar>
               <w:top w:w="80" w:type="dxa"/>
               <w:start w:w="120" w:type="dxa"/>
@@ -1749,7 +1749,7 @@
         </w:tc>
         <w:tc>
           <w:tcPr>
-            <w:tcW w:type="dxa" w:w="1600"/>
+            <w:tcW w:type="dxa" w:w="1500"/>
             <w:tcMar>
               <w:top w:w="80" w:type="dxa"/>
               <w:start w:w="120" w:type="dxa"/>
@@ -1776,7 +1776,7 @@
         </w:tc>
         <w:tc>
           <w:tcPr>
-            <w:tcW w:type="dxa" w:w="1600"/>
+            <w:tcW w:type="dxa" w:w="1500"/>
             <w:tcMar>
               <w:top w:w="80" w:type="dxa"/>
               <w:start w:w="120" w:type="dxa"/>
@@ -1803,7 +1803,7 @@
         </w:tc>
         <w:tc>
           <w:tcPr>
-            <w:tcW w:type="dxa" w:w="1160"/>
+            <w:tcW w:type="dxa" w:w="1810"/>
             <w:tcMar>
               <w:top w:w="80" w:type="dxa"/>
               <w:start w:w="120" w:type="dxa"/>
@@ -1824,7 +1824,7 @@
                 <w:color w:val="000000"/>
                 <w:sz w:val="19"/>
               </w:rPr>
-              <w:t>✅ 已完成</w:t>
+              <w:t>🟠 自覺調整 (63%, B+)</w:t>
             </w:r>
           </w:p>
         </w:tc>
@@ -1832,7 +1832,7 @@
       <w:tr>
         <w:tc>
           <w:tcPr>
-            <w:tcW w:type="dxa" w:w="1100"/>
+            <w:tcW w:type="dxa" w:w="1050"/>
             <w:tcMar>
               <w:top w:w="80" w:type="dxa"/>
               <w:start w:w="120" w:type="dxa"/>
@@ -1861,7 +1861,7 @@
         </w:tc>
         <w:tc>
           <w:tcPr>
-            <w:tcW w:type="dxa" w:w="3100"/>
+            <w:tcW w:type="dxa" w:w="2750"/>
             <w:tcMar>
               <w:top w:w="80" w:type="dxa"/>
               <w:start w:w="120" w:type="dxa"/>
@@ -1888,7 +1888,7 @@
         </w:tc>
         <w:tc>
           <w:tcPr>
-            <w:tcW w:type="dxa" w:w="1100"/>
+            <w:tcW w:type="dxa" w:w="1050"/>
             <w:tcMar>
               <w:top w:w="80" w:type="dxa"/>
               <w:start w:w="120" w:type="dxa"/>
@@ -1915,7 +1915,7 @@
         </w:tc>
         <w:tc>
           <w:tcPr>
-            <w:tcW w:type="dxa" w:w="1600"/>
+            <w:tcW w:type="dxa" w:w="1500"/>
             <w:tcMar>
               <w:top w:w="80" w:type="dxa"/>
               <w:start w:w="120" w:type="dxa"/>
@@ -1942,7 +1942,7 @@
         </w:tc>
         <w:tc>
           <w:tcPr>
-            <w:tcW w:type="dxa" w:w="1600"/>
+            <w:tcW w:type="dxa" w:w="1500"/>
             <w:tcMar>
               <w:top w:w="80" w:type="dxa"/>
               <w:start w:w="120" w:type="dxa"/>
@@ -1969,7 +1969,7 @@
         </w:tc>
         <w:tc>
           <w:tcPr>
-            <w:tcW w:type="dxa" w:w="1160"/>
+            <w:tcW w:type="dxa" w:w="1810"/>
             <w:tcMar>
               <w:top w:w="80" w:type="dxa"/>
               <w:start w:w="120" w:type="dxa"/>
@@ -1990,7 +1990,7 @@
                 <w:color w:val="000000"/>
                 <w:sz w:val="19"/>
               </w:rPr>
-              <w:t>✅ 已完成</w:t>
+              <w:t>🟢 良好達標 (79%, A-)</w:t>
             </w:r>
           </w:p>
         </w:tc>
@@ -1998,7 +1998,7 @@
       <w:tr>
         <w:tc>
           <w:tcPr>
-            <w:tcW w:type="dxa" w:w="1100"/>
+            <w:tcW w:type="dxa" w:w="1050"/>
             <w:tcMar>
               <w:top w:w="80" w:type="dxa"/>
               <w:start w:w="120" w:type="dxa"/>
@@ -2027,7 +2027,7 @@
         </w:tc>
         <w:tc>
           <w:tcPr>
-            <w:tcW w:type="dxa" w:w="3100"/>
+            <w:tcW w:type="dxa" w:w="2750"/>
             <w:tcMar>
               <w:top w:w="80" w:type="dxa"/>
               <w:start w:w="120" w:type="dxa"/>
@@ -2054,7 +2054,7 @@
         </w:tc>
         <w:tc>
           <w:tcPr>
-            <w:tcW w:type="dxa" w:w="1100"/>
+            <w:tcW w:type="dxa" w:w="1050"/>
             <w:tcMar>
               <w:top w:w="80" w:type="dxa"/>
               <w:start w:w="120" w:type="dxa"/>
@@ -2081,7 +2081,7 @@
         </w:tc>
         <w:tc>
           <w:tcPr>
-            <w:tcW w:type="dxa" w:w="1600"/>
+            <w:tcW w:type="dxa" w:w="1500"/>
             <w:tcMar>
               <w:top w:w="80" w:type="dxa"/>
               <w:start w:w="120" w:type="dxa"/>
@@ -2108,7 +2108,7 @@
         </w:tc>
         <w:tc>
           <w:tcPr>
-            <w:tcW w:type="dxa" w:w="1600"/>
+            <w:tcW w:type="dxa" w:w="1500"/>
             <w:tcMar>
               <w:top w:w="80" w:type="dxa"/>
               <w:start w:w="120" w:type="dxa"/>
@@ -2135,7 +2135,7 @@
         </w:tc>
         <w:tc>
           <w:tcPr>
-            <w:tcW w:type="dxa" w:w="1160"/>
+            <w:tcW w:type="dxa" w:w="1810"/>
             <w:tcMar>
               <w:top w:w="80" w:type="dxa"/>
               <w:start w:w="120" w:type="dxa"/>
@@ -2156,7 +2156,7 @@
                 <w:color w:val="000000"/>
                 <w:sz w:val="19"/>
               </w:rPr>
-              <w:t>✅ 已完成</w:t>
+              <w:t>✅ 精準達標 (100%, A+)</w:t>
             </w:r>
           </w:p>
         </w:tc>
@@ -2164,7 +2164,7 @@
       <w:tr>
         <w:tc>
           <w:tcPr>
-            <w:tcW w:type="dxa" w:w="1100"/>
+            <w:tcW w:type="dxa" w:w="1050"/>
             <w:tcMar>
               <w:top w:w="80" w:type="dxa"/>
               <w:start w:w="120" w:type="dxa"/>
@@ -2193,7 +2193,7 @@
         </w:tc>
         <w:tc>
           <w:tcPr>
-            <w:tcW w:type="dxa" w:w="3100"/>
+            <w:tcW w:type="dxa" w:w="2750"/>
             <w:tcMar>
               <w:top w:w="80" w:type="dxa"/>
               <w:start w:w="120" w:type="dxa"/>
@@ -2220,7 +2220,7 @@
         </w:tc>
         <w:tc>
           <w:tcPr>
-            <w:tcW w:type="dxa" w:w="1100"/>
+            <w:tcW w:type="dxa" w:w="1050"/>
             <w:tcMar>
               <w:top w:w="80" w:type="dxa"/>
               <w:start w:w="120" w:type="dxa"/>
@@ -2247,7 +2247,7 @@
         </w:tc>
         <w:tc>
           <w:tcPr>
-            <w:tcW w:type="dxa" w:w="1600"/>
+            <w:tcW w:type="dxa" w:w="1500"/>
             <w:tcMar>
               <w:top w:w="80" w:type="dxa"/>
               <w:start w:w="120" w:type="dxa"/>
@@ -2274,7 +2274,7 @@
         </w:tc>
         <w:tc>
           <w:tcPr>
-            <w:tcW w:type="dxa" w:w="1600"/>
+            <w:tcW w:type="dxa" w:w="1500"/>
             <w:tcMar>
               <w:top w:w="80" w:type="dxa"/>
               <w:start w:w="120" w:type="dxa"/>
@@ -2301,7 +2301,7 @@
         </w:tc>
         <w:tc>
           <w:tcPr>
-            <w:tcW w:type="dxa" w:w="1160"/>
+            <w:tcW w:type="dxa" w:w="1810"/>
             <w:tcMar>
               <w:top w:w="80" w:type="dxa"/>
               <w:start w:w="120" w:type="dxa"/>
@@ -2322,7 +2322,7 @@
                 <w:color w:val="000000"/>
                 <w:sz w:val="19"/>
               </w:rPr>
-              <w:t>✅ 已完成</w:t>
+              <w:t>⚡ 超額完成 (140%, A)</w:t>
             </w:r>
           </w:p>
         </w:tc>
@@ -2330,7 +2330,7 @@
       <w:tr>
         <w:tc>
           <w:tcPr>
-            <w:tcW w:type="dxa" w:w="1100"/>
+            <w:tcW w:type="dxa" w:w="1050"/>
             <w:tcMar>
               <w:top w:w="80" w:type="dxa"/>
               <w:start w:w="120" w:type="dxa"/>
@@ -2359,7 +2359,7 @@
         </w:tc>
         <w:tc>
           <w:tcPr>
-            <w:tcW w:type="dxa" w:w="3100"/>
+            <w:tcW w:type="dxa" w:w="2750"/>
             <w:tcMar>
               <w:top w:w="80" w:type="dxa"/>
               <w:start w:w="120" w:type="dxa"/>
@@ -2386,7 +2386,7 @@
         </w:tc>
         <w:tc>
           <w:tcPr>
-            <w:tcW w:type="dxa" w:w="1100"/>
+            <w:tcW w:type="dxa" w:w="1050"/>
             <w:tcMar>
               <w:top w:w="80" w:type="dxa"/>
               <w:start w:w="120" w:type="dxa"/>
@@ -2413,7 +2413,7 @@
         </w:tc>
         <w:tc>
           <w:tcPr>
-            <w:tcW w:type="dxa" w:w="1600"/>
+            <w:tcW w:type="dxa" w:w="1500"/>
             <w:tcMar>
               <w:top w:w="80" w:type="dxa"/>
               <w:start w:w="120" w:type="dxa"/>
@@ -2440,7 +2440,7 @@
         </w:tc>
         <w:tc>
           <w:tcPr>
-            <w:tcW w:type="dxa" w:w="1600"/>
+            <w:tcW w:type="dxa" w:w="1500"/>
             <w:tcMar>
               <w:top w:w="80" w:type="dxa"/>
               <w:start w:w="120" w:type="dxa"/>
@@ -2467,7 +2467,7 @@
         </w:tc>
         <w:tc>
           <w:tcPr>
-            <w:tcW w:type="dxa" w:w="1160"/>
+            <w:tcW w:type="dxa" w:w="1810"/>
             <w:tcMar>
               <w:top w:w="80" w:type="dxa"/>
               <w:start w:w="120" w:type="dxa"/>
@@ -2488,7 +2488,7 @@
                 <w:color w:val="000000"/>
                 <w:sz w:val="19"/>
               </w:rPr>
-              <w:t>❌ 未執行</w:t>
+              <w:t>❌ 未執行/待排程</w:t>
             </w:r>
           </w:p>
         </w:tc>
@@ -2496,7 +2496,7 @@
       <w:tr>
         <w:tc>
           <w:tcPr>
-            <w:tcW w:type="dxa" w:w="1100"/>
+            <w:tcW w:type="dxa" w:w="1050"/>
             <w:tcMar>
               <w:top w:w="80" w:type="dxa"/>
               <w:start w:w="120" w:type="dxa"/>
@@ -2525,7 +2525,7 @@
         </w:tc>
         <w:tc>
           <w:tcPr>
-            <w:tcW w:type="dxa" w:w="3100"/>
+            <w:tcW w:type="dxa" w:w="2750"/>
             <w:tcMar>
               <w:top w:w="80" w:type="dxa"/>
               <w:start w:w="120" w:type="dxa"/>
@@ -2552,7 +2552,7 @@
         </w:tc>
         <w:tc>
           <w:tcPr>
-            <w:tcW w:type="dxa" w:w="1100"/>
+            <w:tcW w:type="dxa" w:w="1050"/>
             <w:tcMar>
               <w:top w:w="80" w:type="dxa"/>
               <w:start w:w="120" w:type="dxa"/>
@@ -2579,7 +2579,7 @@
         </w:tc>
         <w:tc>
           <w:tcPr>
-            <w:tcW w:type="dxa" w:w="1600"/>
+            <w:tcW w:type="dxa" w:w="1500"/>
             <w:tcMar>
               <w:top w:w="80" w:type="dxa"/>
               <w:start w:w="120" w:type="dxa"/>
@@ -2606,7 +2606,7 @@
         </w:tc>
         <w:tc>
           <w:tcPr>
-            <w:tcW w:type="dxa" w:w="1600"/>
+            <w:tcW w:type="dxa" w:w="1500"/>
             <w:tcMar>
               <w:top w:w="80" w:type="dxa"/>
               <w:start w:w="120" w:type="dxa"/>
@@ -2633,7 +2633,7 @@
         </w:tc>
         <w:tc>
           <w:tcPr>
-            <w:tcW w:type="dxa" w:w="1160"/>
+            <w:tcW w:type="dxa" w:w="1810"/>
             <w:tcMar>
               <w:top w:w="80" w:type="dxa"/>
               <w:start w:w="120" w:type="dxa"/>
@@ -2654,7 +2654,7 @@
                 <w:color w:val="000000"/>
                 <w:sz w:val="19"/>
               </w:rPr>
-              <w:t>休息日</w:t>
+              <w:t>⏸️ 完全休息日</w:t>
             </w:r>
           </w:p>
         </w:tc>
@@ -2662,7 +2662,7 @@
       <w:tr>
         <w:tc>
           <w:tcPr>
-            <w:tcW w:type="dxa" w:w="1100"/>
+            <w:tcW w:type="dxa" w:w="1050"/>
             <w:tcMar>
               <w:top w:w="80" w:type="dxa"/>
               <w:start w:w="120" w:type="dxa"/>
@@ -2691,7 +2691,7 @@
         </w:tc>
         <w:tc>
           <w:tcPr>
-            <w:tcW w:type="dxa" w:w="3100"/>
+            <w:tcW w:type="dxa" w:w="2750"/>
             <w:tcMar>
               <w:top w:w="80" w:type="dxa"/>
               <w:start w:w="120" w:type="dxa"/>
@@ -2718,7 +2718,7 @@
         </w:tc>
         <w:tc>
           <w:tcPr>
-            <w:tcW w:type="dxa" w:w="1100"/>
+            <w:tcW w:type="dxa" w:w="1050"/>
             <w:tcMar>
               <w:top w:w="80" w:type="dxa"/>
               <w:start w:w="120" w:type="dxa"/>
@@ -2745,7 +2745,7 @@
         </w:tc>
         <w:tc>
           <w:tcPr>
-            <w:tcW w:type="dxa" w:w="1600"/>
+            <w:tcW w:type="dxa" w:w="1500"/>
             <w:tcMar>
               <w:top w:w="80" w:type="dxa"/>
               <w:start w:w="120" w:type="dxa"/>
@@ -2772,7 +2772,7 @@
         </w:tc>
         <w:tc>
           <w:tcPr>
-            <w:tcW w:type="dxa" w:w="1600"/>
+            <w:tcW w:type="dxa" w:w="1500"/>
             <w:tcMar>
               <w:top w:w="80" w:type="dxa"/>
               <w:start w:w="120" w:type="dxa"/>
@@ -2799,7 +2799,7 @@
         </w:tc>
         <w:tc>
           <w:tcPr>
-            <w:tcW w:type="dxa" w:w="1160"/>
+            <w:tcW w:type="dxa" w:w="1810"/>
             <w:tcMar>
               <w:top w:w="80" w:type="dxa"/>
               <w:start w:w="120" w:type="dxa"/>
@@ -2820,7 +2820,7 @@
                 <w:color w:val="000000"/>
                 <w:sz w:val="19"/>
               </w:rPr>
-              <w:t>休息日</w:t>
+              <w:t>⏸️ 完全休息日</w:t>
             </w:r>
           </w:p>
         </w:tc>
@@ -2842,7 +2842,7 @@
           <w:color w:val="2E74B5"/>
           <w:sz w:val="24"/>
         </w:rPr>
-        <w:t>1. 執行亮點 (Execution Highlights)</w:t>
+        <w:t>1. 執行亮點與成效分析 (Execution Highlights &amp; Milestone Analytics)</w:t>
       </w:r>
     </w:p>
     <w:p>
@@ -2851,7 +2851,19 @@
         <w:br/>
       </w:r>
       <w:r>
-        <w:t>• 在高負荷訓練後無縫銜接轉換跑，並依據即時心率與體感自覺彈性調整，兼顧神經肌肉適應與傷害防範。</w:t>
+        <w:t>• Base 3-3 調整週超補償節奏精準：在歷經 W33 大量週後，本週落實體能吸收與神經超補償，課表質優且疲勞管理得當。</w:t>
+        <w:br/>
+      </w:r>
+      <w:r>
+        <w:t>• 週四單車 TEMPO 3x15 ＋ 轉換跑精準達標：8/20 單車 85 分鐘 100% 達標 (NP 162W, 142 bpm)，TEMPO 區間精準鎖定在 155W-165W；下車後無縫銜接 28 分鐘 (3.66km) 轉換跑，高步頻 (176 spm) 與輕著地展現極佳的神經肌肉轉向適應力。</w:t>
+        <w:br/>
+      </w:r>
+      <w:r>
+        <w:t>• 週三甜甜泳課 3.15km 高效巡航：8/19 游泳 63 分鐘游出 2:02/100m 均速，核心流線型支撐與水感推進力優異。</w:t>
+        <w:br/>
+      </w:r>
+      <w:r>
+        <w:t>• 週二 Z2 跑步成熟自覺收操：8/18 跑步 57 分鐘 (9.45km, 6:06/km)，主動於 9.45km 適度收操防傷，既獲取有氧刺激又防範過度疲勞。</w:t>
         <w:br/>
       </w:r>
     </w:p>
@@ -2863,24 +2875,20 @@
           <w:color w:val="2E74B5"/>
           <w:sz w:val="24"/>
         </w:rPr>
-        <w:t>2. 需注意的細節與配速紀律 (Key Watchpoints &amp; Power Pacing)</w:t>
+        <w:t>2. 需注意的細節與配速/功率紀律 (Key Watchpoints &amp; Power Pacing)</w:t>
       </w:r>
     </w:p>
     <w:p>
       <w:r>
-        <w:t>• 自行車長距離 (LSD) 功率控制：對標 Sub-11 藍圖 (5h30m / 140W-145W)，前段請克制輸出，爬坡嚴守 174W (85% FTP) 上限，避免有氧解離過大。</w:t>
+        <w:t>• 自行車功率控制與有氧冷卻：對標 Sub-11 藍圖 (5h30m / 140W-145W)，長距離 LSD 前段克制輸出在 140W-150W，TEMPO 課表守在 155W-165W，爬坡嚴守 174W (85% FTP) 上限；下車前最後 10–15 公里主動降瓦至 123W–133W 並維持 85–90 rpm 高踏頻冷卻。</w:t>
         <w:br/>
       </w:r>
       <w:r>
-        <w:t>• 下車前最後 10–15 公里主動降瓦至 123W–133W 並維持高踏頻，加速乳酸代謝。</w:t>
+        <w:t>• 下車轉換跑步頻與著地剛性：下車後跑步前 5 公里維持 175–180 spm 小步幅高步頻，觸地時間控制在 &lt;270ms，垂直比 &lt;9%，心率巡航在 145-155 bpm，保護膝蓋與全馬關節剛性。</w:t>
         <w:br/>
       </w:r>
       <w:r>
-        <w:t>• 跑步維持 175–180 spm 步頻與短觸地時間，保護關節與下半程剛性。</w:t>
-        <w:br/>
-      </w:r>
-      <w:r>
-        <w:t>• 游泳巡航手感定型：維持放鬆 Zone 1-2 低心率划水，出水前保持平穩定位，直指 Sub-11 1:12:00 (1:53/100m) 配速線。</w:t>
+        <w:t>• 游泳長距離巡航手感定型：保持放鬆 Zone 1-2 低心率划水與核心流線型，出水前練習抬頭定位 (Sighting) 節奏，目標直指 Sub-11 1:12:00 (1:53/100m) 配速線。</w:t>
         <w:br/>
       </w:r>
     </w:p>
@@ -2897,15 +2905,15 @@
     </w:p>
     <w:p>
       <w:r>
-        <w:t>• 持續每 1–2 小時補充含電解質飲品，直至尿液顏色恢復清淡。</w:t>
+        <w:t>• 補水與電解質補充：高溫與大消耗訓練後，持續每 1–2 小時補充含電解質飲品，直至尿液顏色恢復清澈淡黃。</w:t>
         <w:br/>
       </w:r>
       <w:r>
-        <w:t>• 訓練後充足補充碳水化合物與每公斤體重 1.5–2.0g 優質蛋白質。</w:t>
+        <w:t>• 醣類與蛋白質黃金窗口：課表後 30 分鐘內充足補充碳水化合物與每公斤體重 1.5–2.0g 優質蛋白質，促進肌糖原快速回補與肌纖維修復。</w:t>
         <w:br/>
       </w:r>
       <w:r>
-        <w:t>• 週末連續雙大日累積負荷高，週一請務必以完全休息 (Rest Day) 或低心率排酸輕鬆游/滾筒伸展為主。</w:t>
+        <w:t>• 睡眠管理與超補償：維持每晚 8 小時優質深層睡眠，促進生長激素分泌以利神經系統吸收本週超補償效益。</w:t>
         <w:br/>
       </w:r>
     </w:p>

</xml_diff>

<commit_message>
Auto Daily 8:00 PM Dashboard Update [2026-08-21 13:34]
</commit_message>
<xml_diff>
--- a/docs/weekly/2026-W34_當週執行率回顧報告.docx
+++ b/docs/weekly/2026-W34_當週執行率回顧報告.docx
@@ -21,7 +21,7 @@
           <w:color w:val="555555"/>
           <w:sz w:val="20"/>
         </w:rPr>
-        <w:t>週期：2026/08/17–2026/08/23　｜　整體時間執行率：74.9%</w:t>
+        <w:t>週期：2026/08/17–2026/08/23　｜　整體時間執行率：59.3%</w:t>
       </w:r>
     </w:p>
     <w:p>
@@ -347,7 +347,7 @@
                 <w:color w:val="000000"/>
                 <w:sz w:val="19"/>
               </w:rPr>
-              <w:t>1.05 hr</w:t>
+              <w:t>2.05 hr</w:t>
             </w:r>
           </w:p>
         </w:tc>
@@ -374,7 +374,7 @@
                 <w:color w:val="000000"/>
                 <w:sz w:val="19"/>
               </w:rPr>
-              <w:t>39.4%</w:t>
+              <w:t>76.9%</w:t>
             </w:r>
           </w:p>
         </w:tc>
@@ -428,7 +428,7 @@
                 <w:color w:val="000000"/>
                 <w:sz w:val="19"/>
               </w:rPr>
-              <w:t>3.15 km</w:t>
+              <w:t>6.25 km</w:t>
             </w:r>
           </w:p>
         </w:tc>
@@ -538,7 +538,7 @@
                 <w:color w:val="000000"/>
                 <w:sz w:val="19"/>
               </w:rPr>
-              <w:t>1.42 hr</w:t>
+              <w:t>4.67 hr</w:t>
             </w:r>
           </w:p>
         </w:tc>
@@ -592,7 +592,7 @@
                 <w:color w:val="000000"/>
                 <w:sz w:val="19"/>
               </w:rPr>
-              <w:t>138.8%</w:t>
+              <w:t>42.1%</w:t>
             </w:r>
           </w:p>
         </w:tc>
@@ -700,7 +700,7 @@
                 <w:color w:val="000000"/>
                 <w:sz w:val="19"/>
               </w:rPr>
-              <w:t>2</w:t>
+              <w:t>3</w:t>
             </w:r>
           </w:p>
         </w:tc>
@@ -2461,6 +2461,172 @@
                 <w:color w:val="000000"/>
                 <w:sz w:val="19"/>
               </w:rPr>
+              <w:t>60分 / 3.10km</w:t>
+            </w:r>
+          </w:p>
+        </w:tc>
+        <w:tc>
+          <w:tcPr>
+            <w:tcW w:type="dxa" w:w="1810"/>
+            <w:tcMar>
+              <w:top w:w="80" w:type="dxa"/>
+              <w:start w:w="120" w:type="dxa"/>
+              <w:bottom w:w="80" w:type="dxa"/>
+              <w:end w:w="120" w:type="dxa"/>
+            </w:tcMar>
+            <w:vAlign w:val="center"/>
+          </w:tcPr>
+          <w:p>
+            <w:pPr>
+              <w:spacing w:after="0"/>
+              <w:jc w:val="center"/>
+            </w:pPr>
+            <w:r>
+              <w:rPr>
+                <w:rFonts w:ascii="Calibri" w:hAnsi="Calibri" w:eastAsia="Microsoft JhengHei"/>
+                <w:b w:val="0"/>
+                <w:color w:val="000000"/>
+                <w:sz w:val="19"/>
+              </w:rPr>
+              <w:t>🟢 良好達標 (75%, A-)</w:t>
+            </w:r>
+          </w:p>
+        </w:tc>
+      </w:tr>
+      <w:tr>
+        <w:tc>
+          <w:tcPr>
+            <w:tcW w:type="dxa" w:w="1050"/>
+            <w:tcMar>
+              <w:top w:w="80" w:type="dxa"/>
+              <w:start w:w="120" w:type="dxa"/>
+              <w:bottom w:w="80" w:type="dxa"/>
+              <w:end w:w="120" w:type="dxa"/>
+            </w:tcMar>
+            <w:vAlign w:val="center"/>
+          </w:tcPr>
+          <w:p>
+            <w:pPr>
+              <w:spacing w:after="0"/>
+              <w:jc w:val="center"/>
+            </w:pPr>
+            <w:r>
+              <w:rPr>
+                <w:rFonts w:ascii="Calibri" w:hAnsi="Calibri" w:eastAsia="Microsoft JhengHei"/>
+                <w:b w:val="0"/>
+                <w:color w:val="000000"/>
+                <w:sz w:val="19"/>
+              </w:rPr>
+              <w:t>08/22</w:t>
+              <w:br/>
+              <w:t>週六</w:t>
+            </w:r>
+          </w:p>
+        </w:tc>
+        <w:tc>
+          <w:tcPr>
+            <w:tcW w:type="dxa" w:w="2750"/>
+            <w:tcMar>
+              <w:top w:w="80" w:type="dxa"/>
+              <w:start w:w="120" w:type="dxa"/>
+              <w:bottom w:w="80" w:type="dxa"/>
+              <w:end w:w="120" w:type="dxa"/>
+            </w:tcMar>
+            <w:vAlign w:val="center"/>
+          </w:tcPr>
+          <w:p>
+            <w:pPr>
+              <w:spacing w:after="0"/>
+              <w:jc w:val="left"/>
+            </w:pPr>
+            <w:r>
+              <w:rPr>
+                <w:rFonts w:ascii="Calibri" w:hAnsi="Calibri" w:eastAsia="Microsoft JhengHei"/>
+                <w:b w:val="0"/>
+                <w:color w:val="000000"/>
+                <w:sz w:val="19"/>
+              </w:rPr>
+              <w:t>Bike: TEMPO 315</w:t>
+            </w:r>
+          </w:p>
+        </w:tc>
+        <w:tc>
+          <w:tcPr>
+            <w:tcW w:type="dxa" w:w="1050"/>
+            <w:tcMar>
+              <w:top w:w="80" w:type="dxa"/>
+              <w:start w:w="120" w:type="dxa"/>
+              <w:bottom w:w="80" w:type="dxa"/>
+              <w:end w:w="120" w:type="dxa"/>
+            </w:tcMar>
+            <w:vAlign w:val="center"/>
+          </w:tcPr>
+          <w:p>
+            <w:pPr>
+              <w:spacing w:after="0"/>
+              <w:jc w:val="center"/>
+            </w:pPr>
+            <w:r>
+              <w:rPr>
+                <w:rFonts w:ascii="Calibri" w:hAnsi="Calibri" w:eastAsia="Microsoft JhengHei"/>
+                <w:b w:val="0"/>
+                <w:color w:val="000000"/>
+                <w:sz w:val="19"/>
+              </w:rPr>
+              <w:t>Bike</w:t>
+            </w:r>
+          </w:p>
+        </w:tc>
+        <w:tc>
+          <w:tcPr>
+            <w:tcW w:type="dxa" w:w="1500"/>
+            <w:tcMar>
+              <w:top w:w="80" w:type="dxa"/>
+              <w:start w:w="120" w:type="dxa"/>
+              <w:bottom w:w="80" w:type="dxa"/>
+              <w:end w:w="120" w:type="dxa"/>
+            </w:tcMar>
+            <w:vAlign w:val="center"/>
+          </w:tcPr>
+          <w:p>
+            <w:pPr>
+              <w:spacing w:after="0"/>
+              <w:jc w:val="center"/>
+            </w:pPr>
+            <w:r>
+              <w:rPr>
+                <w:rFonts w:ascii="Calibri" w:hAnsi="Calibri" w:eastAsia="Microsoft JhengHei"/>
+                <w:b w:val="0"/>
+                <w:color w:val="000000"/>
+                <w:sz w:val="19"/>
+              </w:rPr>
+              <w:t>195分</w:t>
+            </w:r>
+          </w:p>
+        </w:tc>
+        <w:tc>
+          <w:tcPr>
+            <w:tcW w:type="dxa" w:w="1500"/>
+            <w:tcMar>
+              <w:top w:w="80" w:type="dxa"/>
+              <w:start w:w="120" w:type="dxa"/>
+              <w:bottom w:w="80" w:type="dxa"/>
+              <w:end w:w="120" w:type="dxa"/>
+            </w:tcMar>
+            <w:vAlign w:val="center"/>
+          </w:tcPr>
+          <w:p>
+            <w:pPr>
+              <w:spacing w:after="0"/>
+              <w:jc w:val="center"/>
+            </w:pPr>
+            <w:r>
+              <w:rPr>
+                <w:rFonts w:ascii="Calibri" w:hAnsi="Calibri" w:eastAsia="Microsoft JhengHei"/>
+                <w:b w:val="0"/>
+                <w:color w:val="000000"/>
+                <w:sz w:val="19"/>
+              </w:rPr>
               <w:t>0分</w:t>
             </w:r>
           </w:p>
@@ -2847,7 +3013,7 @@
     </w:p>
     <w:p>
       <w:r>
-        <w:t>• 當週累積自行車 41.40 km、跑步 13.11 km、游泳 3.15 km，整體時間執行率達 74.9%。</w:t>
+        <w:t>• 當週累積自行車 41.40 km、跑步 13.11 km、游泳 6.25 km，整體時間執行率達 59.3%。</w:t>
         <w:br/>
       </w:r>
       <w:r>

</xml_diff>

<commit_message>
Auto Daily 8:00 PM Dashboard Update [2026-08-23 15:25]
</commit_message>
<xml_diff>
--- a/docs/weekly/2026-W34_當週執行率回顧報告.docx
+++ b/docs/weekly/2026-W34_當週執行率回顧報告.docx
@@ -2991,6 +2991,172 @@
           </w:p>
         </w:tc>
       </w:tr>
+      <w:tr>
+        <w:tc>
+          <w:tcPr>
+            <w:tcW w:type="dxa" w:w="1050"/>
+            <w:tcMar>
+              <w:top w:w="80" w:type="dxa"/>
+              <w:start w:w="120" w:type="dxa"/>
+              <w:bottom w:w="80" w:type="dxa"/>
+              <w:end w:w="120" w:type="dxa"/>
+            </w:tcMar>
+            <w:vAlign w:val="center"/>
+          </w:tcPr>
+          <w:p>
+            <w:pPr>
+              <w:spacing w:after="0"/>
+              <w:jc w:val="center"/>
+            </w:pPr>
+            <w:r>
+              <w:rPr>
+                <w:rFonts w:ascii="Calibri" w:hAnsi="Calibri" w:eastAsia="Microsoft JhengHei"/>
+                <w:b w:val="0"/>
+                <w:color w:val="000000"/>
+                <w:sz w:val="19"/>
+              </w:rPr>
+              <w:t>08/23</w:t>
+              <w:br/>
+              <w:t>週日</w:t>
+            </w:r>
+          </w:p>
+        </w:tc>
+        <w:tc>
+          <w:tcPr>
+            <w:tcW w:type="dxa" w:w="2750"/>
+            <w:tcMar>
+              <w:top w:w="80" w:type="dxa"/>
+              <w:start w:w="120" w:type="dxa"/>
+              <w:bottom w:w="80" w:type="dxa"/>
+              <w:end w:w="120" w:type="dxa"/>
+            </w:tcMar>
+            <w:vAlign w:val="center"/>
+          </w:tcPr>
+          <w:p>
+            <w:pPr>
+              <w:spacing w:after="0"/>
+              <w:jc w:val="left"/>
+            </w:pPr>
+            <w:r>
+              <w:rPr>
+                <w:rFonts w:ascii="Calibri" w:hAnsi="Calibri" w:eastAsia="Microsoft JhengHei"/>
+                <w:b w:val="0"/>
+                <w:color w:val="000000"/>
+                <w:sz w:val="19"/>
+              </w:rPr>
+              <w:t>Walk: Walking</w:t>
+            </w:r>
+          </w:p>
+        </w:tc>
+        <w:tc>
+          <w:tcPr>
+            <w:tcW w:type="dxa" w:w="1050"/>
+            <w:tcMar>
+              <w:top w:w="80" w:type="dxa"/>
+              <w:start w:w="120" w:type="dxa"/>
+              <w:bottom w:w="80" w:type="dxa"/>
+              <w:end w:w="120" w:type="dxa"/>
+            </w:tcMar>
+            <w:vAlign w:val="center"/>
+          </w:tcPr>
+          <w:p>
+            <w:pPr>
+              <w:spacing w:after="0"/>
+              <w:jc w:val="center"/>
+            </w:pPr>
+            <w:r>
+              <w:rPr>
+                <w:rFonts w:ascii="Calibri" w:hAnsi="Calibri" w:eastAsia="Microsoft JhengHei"/>
+                <w:b w:val="0"/>
+                <w:color w:val="000000"/>
+                <w:sz w:val="19"/>
+              </w:rPr>
+              <w:t>Other</w:t>
+            </w:r>
+          </w:p>
+        </w:tc>
+        <w:tc>
+          <w:tcPr>
+            <w:tcW w:type="dxa" w:w="1500"/>
+            <w:tcMar>
+              <w:top w:w="80" w:type="dxa"/>
+              <w:start w:w="120" w:type="dxa"/>
+              <w:bottom w:w="80" w:type="dxa"/>
+              <w:end w:w="120" w:type="dxa"/>
+            </w:tcMar>
+            <w:vAlign w:val="center"/>
+          </w:tcPr>
+          <w:p>
+            <w:pPr>
+              <w:spacing w:after="0"/>
+              <w:jc w:val="center"/>
+            </w:pPr>
+            <w:r>
+              <w:rPr>
+                <w:rFonts w:ascii="Calibri" w:hAnsi="Calibri" w:eastAsia="Microsoft JhengHei"/>
+                <w:b w:val="0"/>
+                <w:color w:val="000000"/>
+                <w:sz w:val="19"/>
+              </w:rPr>
+              <w:t>0分</w:t>
+            </w:r>
+          </w:p>
+        </w:tc>
+        <w:tc>
+          <w:tcPr>
+            <w:tcW w:type="dxa" w:w="1500"/>
+            <w:tcMar>
+              <w:top w:w="80" w:type="dxa"/>
+              <w:start w:w="120" w:type="dxa"/>
+              <w:bottom w:w="80" w:type="dxa"/>
+              <w:end w:w="120" w:type="dxa"/>
+            </w:tcMar>
+            <w:vAlign w:val="center"/>
+          </w:tcPr>
+          <w:p>
+            <w:pPr>
+              <w:spacing w:after="0"/>
+              <w:jc w:val="center"/>
+            </w:pPr>
+            <w:r>
+              <w:rPr>
+                <w:rFonts w:ascii="Calibri" w:hAnsi="Calibri" w:eastAsia="Microsoft JhengHei"/>
+                <w:b w:val="0"/>
+                <w:color w:val="000000"/>
+                <w:sz w:val="19"/>
+              </w:rPr>
+              <w:t>28分 / 0.90km</w:t>
+            </w:r>
+          </w:p>
+        </w:tc>
+        <w:tc>
+          <w:tcPr>
+            <w:tcW w:type="dxa" w:w="1810"/>
+            <w:tcMar>
+              <w:top w:w="80" w:type="dxa"/>
+              <w:start w:w="120" w:type="dxa"/>
+              <w:bottom w:w="80" w:type="dxa"/>
+              <w:end w:w="120" w:type="dxa"/>
+            </w:tcMar>
+            <w:vAlign w:val="center"/>
+          </w:tcPr>
+          <w:p>
+            <w:pPr>
+              <w:spacing w:after="0"/>
+              <w:jc w:val="center"/>
+            </w:pPr>
+            <w:r>
+              <w:rPr>
+                <w:rFonts w:ascii="Calibri" w:hAnsi="Calibri" w:eastAsia="Microsoft JhengHei"/>
+                <w:b w:val="0"/>
+                <w:color w:val="000000"/>
+                <w:sz w:val="19"/>
+              </w:rPr>
+              <w:t>✨ 動態排酸 (A)</w:t>
+            </w:r>
+          </w:p>
+        </w:tc>
+      </w:tr>
     </w:tbl>
     <w:p>
       <w:pPr>

</xml_diff>